<commit_message>
Masukan PSU, invoice lab, kop surat template, dan perbaikan menyeluruh
</commit_message>
<xml_diff>
--- a/server/database/templates/surat-kesediaan-surveillance.docx
+++ b/server/database/templates/surat-kesediaan-surveillance.docx
@@ -4,6 +4,7 @@
   <w:body>
     <w:p>
       <w:pPr>
+        <w:spacing w:after="280"/>
         <w:jc w:val="center"/>
       </w:pPr>
       <w:r>
@@ -14,8 +15,10 @@
         <w:t>SURAT PERNYATAAN KESEDIAAN SURVEILLANCE</w:t>
       </w:r>
     </w:p>
-    <w:p/>
     <w:p>
+      <w:pPr>
+        <w:spacing w:after="140"/>
+      </w:pPr>
       <w:r>
         <w:t>Yang bertanda tangan di bawah ini:</w:t>
       </w:r>
@@ -26,9 +29,9 @@
         <w:tblLook w:firstColumn="1" w:firstRow="1" w:lastColumn="0" w:lastRow="0" w:noHBand="0" w:noVBand="1" w:val="04A0"/>
       </w:tblPr>
       <w:tblGrid>
-        <w:gridCol w:w="3135"/>
-        <w:gridCol w:w="3135"/>
-        <w:gridCol w:w="3135"/>
+        <w:gridCol w:w="2835"/>
+        <w:gridCol w:w="283"/>
+        <w:gridCol w:w="5669"/>
       </w:tblGrid>
       <w:tr>
         <w:tc>
@@ -36,6 +39,9 @@
             <w:tcW w:type="dxa" w:w="2835"/>
           </w:tcPr>
           <w:p>
+            <w:pPr>
+              <w:spacing w:after="60"/>
+            </w:pPr>
             <w:r>
               <w:t>Nama Perusahaan</w:t>
             </w:r>
@@ -46,6 +52,9 @@
             <w:tcW w:type="dxa" w:w="283"/>
           </w:tcPr>
           <w:p>
+            <w:pPr>
+              <w:spacing w:after="60"/>
+            </w:pPr>
             <w:r>
               <w:t>:</w:t>
             </w:r>
@@ -56,6 +65,9 @@
             <w:tcW w:type="dxa" w:w="5669"/>
           </w:tcPr>
           <w:p>
+            <w:pPr>
+              <w:spacing w:after="60"/>
+            </w:pPr>
             <w:r>
               <w:t>..................................................</w:t>
             </w:r>
@@ -68,6 +80,9 @@
             <w:tcW w:type="dxa" w:w="2835"/>
           </w:tcPr>
           <w:p>
+            <w:pPr>
+              <w:spacing w:after="60"/>
+            </w:pPr>
             <w:r>
               <w:t>Alamat Perusahaan</w:t>
             </w:r>
@@ -78,6 +93,9 @@
             <w:tcW w:type="dxa" w:w="283"/>
           </w:tcPr>
           <w:p>
+            <w:pPr>
+              <w:spacing w:after="60"/>
+            </w:pPr>
             <w:r>
               <w:t>:</w:t>
             </w:r>
@@ -88,6 +106,9 @@
             <w:tcW w:type="dxa" w:w="5669"/>
           </w:tcPr>
           <w:p>
+            <w:pPr>
+              <w:spacing w:after="60"/>
+            </w:pPr>
             <w:r>
               <w:t>..................................................</w:t>
             </w:r>
@@ -100,8 +121,11 @@
             <w:tcW w:type="dxa" w:w="2835"/>
           </w:tcPr>
           <w:p>
+            <w:pPr>
+              <w:spacing w:after="60"/>
+            </w:pPr>
             <w:r>
-              <w:t>NIB / NPWP</w:t>
+              <w:t>NIB</w:t>
             </w:r>
           </w:p>
         </w:tc>
@@ -110,6 +134,9 @@
             <w:tcW w:type="dxa" w:w="283"/>
           </w:tcPr>
           <w:p>
+            <w:pPr>
+              <w:spacing w:after="60"/>
+            </w:pPr>
             <w:r>
               <w:t>:</w:t>
             </w:r>
@@ -120,6 +147,9 @@
             <w:tcW w:type="dxa" w:w="5669"/>
           </w:tcPr>
           <w:p>
+            <w:pPr>
+              <w:spacing w:after="60"/>
+            </w:pPr>
             <w:r>
               <w:t>..................................................</w:t>
             </w:r>
@@ -132,8 +162,11 @@
             <w:tcW w:type="dxa" w:w="2835"/>
           </w:tcPr>
           <w:p>
+            <w:pPr>
+              <w:spacing w:after="60"/>
+            </w:pPr>
             <w:r>
-              <w:t>Nama Penanggung Jawab</w:t>
+              <w:t>NPWP</w:t>
             </w:r>
           </w:p>
         </w:tc>
@@ -142,6 +175,9 @@
             <w:tcW w:type="dxa" w:w="283"/>
           </w:tcPr>
           <w:p>
+            <w:pPr>
+              <w:spacing w:after="60"/>
+            </w:pPr>
             <w:r>
               <w:t>:</w:t>
             </w:r>
@@ -152,6 +188,9 @@
             <w:tcW w:type="dxa" w:w="5669"/>
           </w:tcPr>
           <w:p>
+            <w:pPr>
+              <w:spacing w:after="60"/>
+            </w:pPr>
             <w:r>
               <w:t>..................................................</w:t>
             </w:r>
@@ -164,8 +203,11 @@
             <w:tcW w:type="dxa" w:w="2835"/>
           </w:tcPr>
           <w:p>
+            <w:pPr>
+              <w:spacing w:after="60"/>
+            </w:pPr>
             <w:r>
-              <w:t>Jabatan</w:t>
+              <w:t>Nama Penanggung Jawab</w:t>
             </w:r>
           </w:p>
         </w:tc>
@@ -174,6 +216,9 @@
             <w:tcW w:type="dxa" w:w="283"/>
           </w:tcPr>
           <w:p>
+            <w:pPr>
+              <w:spacing w:after="60"/>
+            </w:pPr>
             <w:r>
               <w:t>:</w:t>
             </w:r>
@@ -184,6 +229,9 @@
             <w:tcW w:type="dxa" w:w="5669"/>
           </w:tcPr>
           <w:p>
+            <w:pPr>
+              <w:spacing w:after="60"/>
+            </w:pPr>
             <w:r>
               <w:t>..................................................</w:t>
             </w:r>
@@ -196,8 +244,11 @@
             <w:tcW w:type="dxa" w:w="2835"/>
           </w:tcPr>
           <w:p>
+            <w:pPr>
+              <w:spacing w:after="60"/>
+            </w:pPr>
             <w:r>
-              <w:t>Nomor Telepon</w:t>
+              <w:t>Jabatan</w:t>
             </w:r>
           </w:p>
         </w:tc>
@@ -206,6 +257,9 @@
             <w:tcW w:type="dxa" w:w="283"/>
           </w:tcPr>
           <w:p>
+            <w:pPr>
+              <w:spacing w:after="60"/>
+            </w:pPr>
             <w:r>
               <w:t>:</w:t>
             </w:r>
@@ -216,6 +270,9 @@
             <w:tcW w:type="dxa" w:w="5669"/>
           </w:tcPr>
           <w:p>
+            <w:pPr>
+              <w:spacing w:after="60"/>
+            </w:pPr>
             <w:r>
               <w:t>..................................................</w:t>
             </w:r>
@@ -228,8 +285,11 @@
             <w:tcW w:type="dxa" w:w="2835"/>
           </w:tcPr>
           <w:p>
+            <w:pPr>
+              <w:spacing w:after="60"/>
+            </w:pPr>
             <w:r>
-              <w:t>Email</w:t>
+              <w:t>Nomor Telepon</w:t>
             </w:r>
           </w:p>
         </w:tc>
@@ -238,6 +298,9 @@
             <w:tcW w:type="dxa" w:w="283"/>
           </w:tcPr>
           <w:p>
+            <w:pPr>
+              <w:spacing w:after="60"/>
+            </w:pPr>
             <w:r>
               <w:t>:</w:t>
             </w:r>
@@ -248,54 +311,9 @@
             <w:tcW w:type="dxa" w:w="5669"/>
           </w:tcPr>
           <w:p>
-            <w:r>
-              <w:t>..................................................</w:t>
-            </w:r>
-          </w:p>
-        </w:tc>
-      </w:tr>
-    </w:tbl>
-    <w:p>
-      <w:r>
-        <w:t>Dengan ini menyatakan bahwa kami bersedia dilakukan kegiatan surveilan oleh PT Penilai Standar Uji terhadap produk:</w:t>
-      </w:r>
-    </w:p>
-    <w:tbl>
-      <w:tblPr>
-        <w:tblW w:type="auto" w:w="0"/>
-        <w:tblLook w:firstColumn="1" w:firstRow="1" w:lastColumn="0" w:lastRow="0" w:noHBand="0" w:noVBand="1" w:val="04A0"/>
-      </w:tblPr>
-      <w:tblGrid>
-        <w:gridCol w:w="3135"/>
-        <w:gridCol w:w="3135"/>
-        <w:gridCol w:w="3135"/>
-      </w:tblGrid>
-      <w:tr>
-        <w:tc>
-          <w:tcPr>
-            <w:tcW w:type="dxa" w:w="2835"/>
-          </w:tcPr>
-          <w:p>
-            <w:r>
-              <w:t>Nama Produk</w:t>
-            </w:r>
-          </w:p>
-        </w:tc>
-        <w:tc>
-          <w:tcPr>
-            <w:tcW w:type="dxa" w:w="283"/>
-          </w:tcPr>
-          <w:p>
-            <w:r>
-              <w:t>:</w:t>
-            </w:r>
-          </w:p>
-        </w:tc>
-        <w:tc>
-          <w:tcPr>
-            <w:tcW w:type="dxa" w:w="5669"/>
-          </w:tcPr>
-          <w:p>
+            <w:pPr>
+              <w:spacing w:after="60"/>
+            </w:pPr>
             <w:r>
               <w:t>..................................................</w:t>
             </w:r>
@@ -308,8 +326,11 @@
             <w:tcW w:type="dxa" w:w="2835"/>
           </w:tcPr>
           <w:p>
+            <w:pPr>
+              <w:spacing w:after="60"/>
+            </w:pPr>
             <w:r>
-              <w:t>Nomor SNI</w:t>
+              <w:t>Email</w:t>
             </w:r>
           </w:p>
         </w:tc>
@@ -318,6 +339,9 @@
             <w:tcW w:type="dxa" w:w="283"/>
           </w:tcPr>
           <w:p>
+            <w:pPr>
+              <w:spacing w:after="60"/>
+            </w:pPr>
             <w:r>
               <w:t>:</w:t>
             </w:r>
@@ -328,6 +352,69 @@
             <w:tcW w:type="dxa" w:w="5669"/>
           </w:tcPr>
           <w:p>
+            <w:pPr>
+              <w:spacing w:after="60"/>
+            </w:pPr>
+            <w:r>
+              <w:t>..................................................</w:t>
+            </w:r>
+          </w:p>
+        </w:tc>
+      </w:tr>
+    </w:tbl>
+    <w:p>
+      <w:pPr>
+        <w:spacing w:after="140"/>
+      </w:pPr>
+      <w:r>
+        <w:t>Dengan ini menyatakan bahwa kami bersedia dilakukan kegiatan surveilan oleh PT Penilai Standar Uji terhadap produk:</w:t>
+      </w:r>
+    </w:p>
+    <w:tbl>
+      <w:tblPr>
+        <w:tblW w:type="auto" w:w="0"/>
+        <w:tblLook w:firstColumn="1" w:firstRow="1" w:lastColumn="0" w:lastRow="0" w:noHBand="0" w:noVBand="1" w:val="04A0"/>
+      </w:tblPr>
+      <w:tblGrid>
+        <w:gridCol w:w="2835"/>
+        <w:gridCol w:w="283"/>
+        <w:gridCol w:w="5669"/>
+      </w:tblGrid>
+      <w:tr>
+        <w:tc>
+          <w:tcPr>
+            <w:tcW w:type="dxa" w:w="2835"/>
+          </w:tcPr>
+          <w:p>
+            <w:pPr>
+              <w:spacing w:after="60"/>
+            </w:pPr>
+            <w:r>
+              <w:t>Nama Produk</w:t>
+            </w:r>
+          </w:p>
+        </w:tc>
+        <w:tc>
+          <w:tcPr>
+            <w:tcW w:type="dxa" w:w="283"/>
+          </w:tcPr>
+          <w:p>
+            <w:pPr>
+              <w:spacing w:after="60"/>
+            </w:pPr>
+            <w:r>
+              <w:t>:</w:t>
+            </w:r>
+          </w:p>
+        </w:tc>
+        <w:tc>
+          <w:tcPr>
+            <w:tcW w:type="dxa" w:w="5669"/>
+          </w:tcPr>
+          <w:p>
+            <w:pPr>
+              <w:spacing w:after="60"/>
+            </w:pPr>
             <w:r>
               <w:t>..................................................</w:t>
             </w:r>
@@ -340,8 +427,11 @@
             <w:tcW w:type="dxa" w:w="2835"/>
           </w:tcPr>
           <w:p>
+            <w:pPr>
+              <w:spacing w:after="60"/>
+            </w:pPr>
             <w:r>
-              <w:t>Merek &amp; Jenis</w:t>
+              <w:t>Nomor SNI</w:t>
             </w:r>
           </w:p>
         </w:tc>
@@ -350,6 +440,9 @@
             <w:tcW w:type="dxa" w:w="283"/>
           </w:tcPr>
           <w:p>
+            <w:pPr>
+              <w:spacing w:after="60"/>
+            </w:pPr>
             <w:r>
               <w:t>:</w:t>
             </w:r>
@@ -360,6 +453,9 @@
             <w:tcW w:type="dxa" w:w="5669"/>
           </w:tcPr>
           <w:p>
+            <w:pPr>
+              <w:spacing w:after="60"/>
+            </w:pPr>
             <w:r>
               <w:t>..................................................</w:t>
             </w:r>
@@ -372,8 +468,11 @@
             <w:tcW w:type="dxa" w:w="2835"/>
           </w:tcPr>
           <w:p>
+            <w:pPr>
+              <w:spacing w:after="60"/>
+            </w:pPr>
             <w:r>
-              <w:t>Nama Pabrik</w:t>
+              <w:t>Merek &amp; Jenis</w:t>
             </w:r>
           </w:p>
         </w:tc>
@@ -382,6 +481,9 @@
             <w:tcW w:type="dxa" w:w="283"/>
           </w:tcPr>
           <w:p>
+            <w:pPr>
+              <w:spacing w:after="60"/>
+            </w:pPr>
             <w:r>
               <w:t>:</w:t>
             </w:r>
@@ -392,6 +494,9 @@
             <w:tcW w:type="dxa" w:w="5669"/>
           </w:tcPr>
           <w:p>
+            <w:pPr>
+              <w:spacing w:after="60"/>
+            </w:pPr>
             <w:r>
               <w:t>..................................................</w:t>
             </w:r>
@@ -404,6 +509,50 @@
             <w:tcW w:type="dxa" w:w="2835"/>
           </w:tcPr>
           <w:p>
+            <w:pPr>
+              <w:spacing w:after="60"/>
+            </w:pPr>
+            <w:r>
+              <w:t>Nama Pabrik</w:t>
+            </w:r>
+          </w:p>
+        </w:tc>
+        <w:tc>
+          <w:tcPr>
+            <w:tcW w:type="dxa" w:w="283"/>
+          </w:tcPr>
+          <w:p>
+            <w:pPr>
+              <w:spacing w:after="60"/>
+            </w:pPr>
+            <w:r>
+              <w:t>:</w:t>
+            </w:r>
+          </w:p>
+        </w:tc>
+        <w:tc>
+          <w:tcPr>
+            <w:tcW w:type="dxa" w:w="5669"/>
+          </w:tcPr>
+          <w:p>
+            <w:pPr>
+              <w:spacing w:after="60"/>
+            </w:pPr>
+            <w:r>
+              <w:t>..................................................</w:t>
+            </w:r>
+          </w:p>
+        </w:tc>
+      </w:tr>
+      <w:tr>
+        <w:tc>
+          <w:tcPr>
+            <w:tcW w:type="dxa" w:w="2835"/>
+          </w:tcPr>
+          <w:p>
+            <w:pPr>
+              <w:spacing w:after="60"/>
+            </w:pPr>
             <w:r>
               <w:t>Alamat Pabrik</w:t>
             </w:r>
@@ -414,6 +563,9 @@
             <w:tcW w:type="dxa" w:w="283"/>
           </w:tcPr>
           <w:p>
+            <w:pPr>
+              <w:spacing w:after="60"/>
+            </w:pPr>
             <w:r>
               <w:t>:</w:t>
             </w:r>
@@ -424,6 +576,9 @@
             <w:tcW w:type="dxa" w:w="5669"/>
           </w:tcPr>
           <w:p>
+            <w:pPr>
+              <w:spacing w:after="60"/>
+            </w:pPr>
             <w:r>
               <w:t>..................................................</w:t>
             </w:r>
@@ -432,6 +587,9 @@
       </w:tr>
     </w:tbl>
     <w:p>
+      <w:pPr>
+        <w:spacing w:after="140"/>
+      </w:pPr>
       <w:r>
         <w:t>Selama masa berlaku sertifikat, kami bersedia:</w:t>
       </w:r>
@@ -439,6 +597,7 @@
     <w:p>
       <w:pPr>
         <w:pStyle w:val="ListNumber"/>
+        <w:spacing w:after="140"/>
       </w:pPr>
       <w:r>
         <w:t>menerima kunjungan audit surveilan sesuai jadwal yang disepakati;</w:t>
@@ -447,6 +606,7 @@
     <w:p>
       <w:pPr>
         <w:pStyle w:val="ListNumber"/>
+        <w:spacing w:after="140"/>
       </w:pPr>
       <w:r>
         <w:t>memberikan akses ke lokasi produksi, gudang, dan catatan yang diperlukan;</w:t>
@@ -455,6 +615,7 @@
     <w:p>
       <w:pPr>
         <w:pStyle w:val="ListNumber"/>
+        <w:spacing w:after="140"/>
       </w:pPr>
       <w:r>
         <w:t>menyediakan contoh produk untuk diuji apabila diminta;</w:t>
@@ -463,19 +624,23 @@
     <w:p>
       <w:pPr>
         <w:pStyle w:val="ListNumber"/>
+        <w:spacing w:after="140"/>
       </w:pPr>
       <w:r>
         <w:t>menanggung biaya surveilan sesuai ketentuan yang berlaku.</w:t>
       </w:r>
     </w:p>
     <w:p>
+      <w:pPr>
+        <w:spacing w:after="140"/>
+      </w:pPr>
       <w:r>
         <w:t>Demikian surat pernyataan ini kami buat dengan sebenarnya tanpa paksaan dari pihak mana pun.</w:t>
       </w:r>
     </w:p>
-    <w:p/>
     <w:p>
       <w:pPr>
+        <w:spacing w:before="160" w:after="140"/>
         <w:jc w:val="right"/>
       </w:pPr>
       <w:r>
@@ -484,6 +649,7 @@
     </w:p>
     <w:p>
       <w:pPr>
+        <w:spacing w:after="140"/>
         <w:jc w:val="right"/>
       </w:pPr>
       <w:r>
@@ -503,13 +669,175 @@
       </w:r>
     </w:p>
     <w:sectPr>
-      <w:pgSz w:w="12240" w:h="15840"/>
-      <w:pgMar w:top="1417" w:right="1417" w:bottom="1417" w:left="1417" w:header="720" w:footer="720" w:gutter="0"/>
+      <w:headerReference w:type="first" r:id="rId9"/>
+      <w:pgSz w:w="11906" w:h="16838"/>
+      <w:pgMar w:top="1134" w:right="1417" w:bottom="1134" w:left="1417" w:header="567" w:footer="720" w:gutter="0"/>
       <w:cols w:space="720"/>
+      <w:titlePg/>
       <w:docGrid w:linePitch="360"/>
     </w:sectPr>
   </w:body>
 </w:document>
+</file>
+
+<file path=word/header1.xml><?xml version="1.0" encoding="utf-8"?>
+<w:hdr xmlns:m="http://schemas.openxmlformats.org/officeDocument/2006/math" xmlns:mc="http://schemas.openxmlformats.org/markup-compatibility/2006" xmlns:mo="http://schemas.microsoft.com/office/mac/office/2008/main" xmlns:mv="urn:schemas-microsoft-com:mac:vml" xmlns:o="urn:schemas-microsoft-com:office:office" xmlns:r="http://schemas.openxmlformats.org/officeDocument/2006/relationships" xmlns:v="urn:schemas-microsoft-com:vml" xmlns:w10="urn:schemas-microsoft-com:office:word" xmlns:w14="http://schemas.microsoft.com/office/word/2010/wordml" xmlns:w="http://schemas.openxmlformats.org/wordprocessingml/2006/main" xmlns:wne="http://schemas.microsoft.com/office/word/2006/wordml" xmlns:wp14="http://schemas.microsoft.com/office/word/2010/wordprocessingDrawing" xmlns:wp="http://schemas.openxmlformats.org/drawingml/2006/wordprocessingDrawing" xmlns:wpc="http://schemas.microsoft.com/office/word/2010/wordprocessingCanvas" xmlns:wpg="http://schemas.microsoft.com/office/word/2010/wordprocessingGroup" xmlns:wpi="http://schemas.microsoft.com/office/word/2010/wordprocessingInk" xmlns:wps="http://schemas.microsoft.com/office/word/2010/wordprocessingShape" mc:Ignorable="w14 wp14">
+  <w:tbl>
+    <w:tblPr>
+      <w:tblW w:type="auto" w:w="0"/>
+      <w:jc w:val="center"/>
+      <w:tblBorders>
+        <w:top w:val="nil"/>
+        <w:left w:val="nil"/>
+        <w:bottom w:val="nil"/>
+        <w:right w:val="nil"/>
+        <w:insideH w:val="nil"/>
+        <w:insideV w:val="nil"/>
+      </w:tblBorders>
+      <w:tblLayout w:type="fixed"/>
+      <w:tblLook w:firstColumn="1" w:firstRow="1" w:lastColumn="0" w:lastRow="0" w:noHBand="0" w:noVBand="1" w:val="04A0"/>
+    </w:tblPr>
+    <w:tblGrid>
+      <w:gridCol w:w="1360"/>
+      <w:gridCol w:w="6350"/>
+      <w:gridCol w:w="1360"/>
+    </w:tblGrid>
+    <w:tr>
+      <w:tc>
+        <w:tcPr>
+          <w:tcW w:type="dxa" w:w="1360"/>
+          <w:vAlign w:val="center"/>
+        </w:tcPr>
+        <w:p>
+          <w:pPr>
+            <w:spacing w:before="0" w:after="0" w:line="240" w:lineRule="auto"/>
+            <w:jc w:val="left"/>
+          </w:pPr>
+          <w:r>
+            <w:drawing>
+              <wp:inline xmlns:a="http://schemas.openxmlformats.org/drawingml/2006/main" xmlns:pic="http://schemas.openxmlformats.org/drawingml/2006/picture">
+                <wp:extent cx="756000" cy="630000"/>
+                <wp:docPr id="1" name="Picture 1"/>
+                <wp:cNvGraphicFramePr>
+                  <a:graphicFrameLocks noChangeAspect="1"/>
+                </wp:cNvGraphicFramePr>
+                <a:graphic>
+                  <a:graphicData uri="http://schemas.openxmlformats.org/drawingml/2006/picture">
+                    <pic:pic>
+                      <pic:nvPicPr>
+                        <pic:cNvPr id="0" name="logo-psu.png"/>
+                        <pic:cNvPicPr/>
+                      </pic:nvPicPr>
+                      <pic:blipFill>
+                        <a:blip r:embed="rId1"/>
+                        <a:stretch>
+                          <a:fillRect/>
+                        </a:stretch>
+                      </pic:blipFill>
+                      <pic:spPr>
+                        <a:xfrm>
+                          <a:off x="0" y="0"/>
+                          <a:ext cx="756000" cy="630000"/>
+                        </a:xfrm>
+                        <a:prstGeom prst="rect"/>
+                      </pic:spPr>
+                    </pic:pic>
+                  </a:graphicData>
+                </a:graphic>
+              </wp:inline>
+            </w:drawing>
+          </w:r>
+        </w:p>
+      </w:tc>
+      <w:tc>
+        <w:tcPr>
+          <w:tcW w:type="dxa" w:w="6350"/>
+          <w:vAlign w:val="center"/>
+        </w:tcPr>
+        <w:p>
+          <w:pPr>
+            <w:spacing w:before="0" w:after="40" w:line="240" w:lineRule="auto"/>
+            <w:jc w:val="center"/>
+          </w:pPr>
+          <w:r>
+            <w:rPr>
+              <w:rFonts w:ascii="Arial" w:hAnsi="Arial" w:eastAsia="Arial"/>
+              <w:b/>
+              <w:sz w:val="30"/>
+            </w:rPr>
+            <w:t>PT PENILAI STANDAR UJI</w:t>
+          </w:r>
+        </w:p>
+        <w:p>
+          <w:pPr>
+            <w:spacing w:before="0" w:after="0" w:line="240" w:lineRule="auto"/>
+            <w:jc w:val="center"/>
+          </w:pPr>
+          <w:r>
+            <w:rPr>
+              <w:rFonts w:ascii="Arial" w:hAnsi="Arial" w:eastAsia="Arial"/>
+              <w:b w:val="0"/>
+              <w:sz w:val="18"/>
+            </w:rPr>
+            <w:t>Jalan Cipinang Muara 1 No. 21 RT. 006 RW.003 Kel. Pondok Bambu, Kec. Duren Sawit, DKI Jakarta</w:t>
+          </w:r>
+        </w:p>
+        <w:p>
+          <w:pPr>
+            <w:spacing w:before="0" w:after="0" w:line="240" w:lineRule="auto"/>
+            <w:jc w:val="center"/>
+          </w:pPr>
+          <w:r>
+            <w:rPr>
+              <w:rFonts w:ascii="Arial" w:hAnsi="Arial" w:eastAsia="Arial"/>
+              <w:b w:val="0"/>
+              <w:sz w:val="18"/>
+            </w:rPr>
+            <w:t>Telp. 021-8602367  |  Email: psuindonesia.info@gmail.com</w:t>
+          </w:r>
+        </w:p>
+        <w:p>
+          <w:pPr>
+            <w:spacing w:before="0" w:after="0" w:line="240" w:lineRule="auto"/>
+            <w:jc w:val="center"/>
+          </w:pPr>
+          <w:r>
+            <w:rPr>
+              <w:rFonts w:ascii="Arial" w:hAnsi="Arial" w:eastAsia="Arial"/>
+              <w:b w:val="0"/>
+              <w:sz w:val="18"/>
+            </w:rPr>
+            <w:t>NPWP: 43.419.874.3-008.000</w:t>
+          </w:r>
+        </w:p>
+      </w:tc>
+      <w:tc>
+        <w:tcPr>
+          <w:tcW w:type="dxa" w:w="1360"/>
+          <w:vAlign w:val="center"/>
+        </w:tcPr>
+        <w:p>
+          <w:pPr>
+            <w:spacing w:before="0" w:after="0" w:line="240" w:lineRule="auto"/>
+          </w:pPr>
+        </w:p>
+      </w:tc>
+    </w:tr>
+  </w:tbl>
+  <w:p>
+    <w:pPr>
+      <w:pBdr>
+        <w:bottom w:val="thickThinSmallGap" w:sz="24" w:space="1" w:color="000000"/>
+      </w:pBdr>
+      <w:spacing w:before="80" w:after="280" w:line="240" w:lineRule="auto"/>
+    </w:pPr>
+    <w:r>
+      <w:rPr>
+        <w:sz w:val="4"/>
+      </w:rPr>
+    </w:r>
+  </w:p>
+</w:hdr>
 </file>
 
 <file path=word/numbering.xml><?xml version="1.0" encoding="utf-8"?>

</xml_diff>